<commit_message>
update report, tweak storage particulars
</commit_message>
<xml_diff>
--- a/report.docx
+++ b/report.docx
@@ -84,14 +84,27 @@
       <w:r>
         <w:t xml:space="preserve">Figure </w:t>
       </w:r>
-      <w:fldSimple w:instr=" SEQ Figure \* ARABIC ">
-        <w:r>
-          <w:rPr>
-            <w:noProof/>
-          </w:rPr>
-          <w:t>1</w:t>
-        </w:r>
-      </w:fldSimple>
+      <w:r>
+        <w:fldChar w:fldCharType="begin"/>
+      </w:r>
+      <w:r>
+        <w:instrText xml:space="preserve"> SEQ Figure \* ARABIC </w:instrText>
+      </w:r>
+      <w:r>
+        <w:fldChar w:fldCharType="separate"/>
+      </w:r>
+      <w:r>
+        <w:rPr>
+          <w:noProof/>
+        </w:rPr>
+        <w:t>1</w:t>
+      </w:r>
+      <w:r>
+        <w:rPr>
+          <w:noProof/>
+        </w:rPr>
+        <w:fldChar w:fldCharType="end"/>
+      </w:r>
       <w:r>
         <w:t>: Diagram of the password manager program</w:t>
       </w:r>
@@ -117,25 +130,49 @@
         <w:t xml:space="preserve"> in the same directory as the program executable. The Vaultfile contains </w:t>
       </w:r>
       <w:r>
-        <w:t>2</w:t>
-      </w:r>
-      <w:r>
-        <w:t xml:space="preserve"> units of information: the salted hash of the vault’s master password and an AES</w:t>
+        <w:t>3</w:t>
+      </w:r>
+      <w:r>
+        <w:t xml:space="preserve"> units of information: the </w:t>
+      </w:r>
+      <w:r>
+        <w:t xml:space="preserve">bcrypt </w:t>
+      </w:r>
+      <w:r>
+        <w:t>salted hash of the vault’s master password</w:t>
+      </w:r>
+      <w:r>
+        <w:t>, the pbkdf2 salt for stretching the password into an encryption key,</w:t>
+      </w:r>
+      <w:r>
+        <w:t xml:space="preserve"> and an AES</w:t>
       </w:r>
       <w:r>
         <w:t>-256</w:t>
       </w:r>
       <w:r>
-        <w:t xml:space="preserve"> (GC</w:t>
-      </w:r>
-      <w:r>
-        <w:t>M</w:t>
+        <w:t xml:space="preserve"> (</w:t>
+      </w:r>
+      <w:r>
+        <w:t>CBC</w:t>
       </w:r>
       <w:r>
         <w:t xml:space="preserve"> mode)</w:t>
       </w:r>
       <w:r>
-        <w:t xml:space="preserve"> encrypted serialized key-value structure containing the vault’s identifier-password pairs.</w:t>
+        <w:t xml:space="preserve"> encrypted </w:t>
+      </w:r>
+      <w:r>
+        <w:t>gob-</w:t>
+      </w:r>
+      <w:r>
+        <w:t>serialized key-value structure containing the vault’s identifier-password pairs.</w:t>
+      </w:r>
+      <w:r>
+        <w:t xml:space="preserve"> </w:t>
+      </w:r>
+      <w:r>
+        <w:t>The serialized store is base64 encoded.</w:t>
       </w:r>
     </w:p>
     <w:p>
@@ -178,7 +215,25 @@
         <w:t>The input will be</w:t>
       </w:r>
       <w:r>
-        <w:t xml:space="preserve"> checked against the Vaultfile’s salted hash. If authentication succeeds, the input password is used as the decryption key to load in the vault contents. The user can then interact with the vault’s contents by supplying the </w:t>
+        <w:t xml:space="preserve"> checked against the Vaultfile’s salted hash. If authentication succeeds, the input password </w:t>
+      </w:r>
+      <w:r>
+        <w:t>is put through the PBKDF2 key-stretcher</w:t>
+      </w:r>
+      <w:r>
+        <w:t xml:space="preserve"> (along with the stored PBKDF2 salt)</w:t>
+      </w:r>
+      <w:r>
+        <w:t xml:space="preserve"> to generate</w:t>
+      </w:r>
+      <w:r>
+        <w:t xml:space="preserve"> the decryption key </w:t>
+      </w:r>
+      <w:r>
+        <w:t xml:space="preserve">used </w:t>
+      </w:r>
+      <w:r>
+        <w:t xml:space="preserve">to load in the vault contents. The user can then interact with the vault’s contents by supplying the </w:t>
       </w:r>
       <w:r>
         <w:t>identifier</w:t>

</xml_diff>